<commit_message>
Add instructor to lab report
</commit_message>
<xml_diff>
--- a/lab02_report_Matveichuk_Stanislav_724_b.docx
+++ b/lab02_report_Matveichuk_Stanislav_724_b.docx
@@ -109,16 +109,16 @@
       <w:r>
         <w:t>Виконав</w:t>
         <w:br/>
-        <w:t>студент групи __________</w:t>
-        <w:br/>
-        <w:t>________________________</w:t>
+        <w:t>студент групи ІКМ-724в</w:t>
+        <w:br/>
+        <w:t>Матвейчук С. В.</w:t>
         <w:br/>
         <w:br/>
       </w:r>
       <w:r>
         <w:t>Перевірив</w:t>
         <w:br/>
-        <w:t>________________________</w:t>
+        <w:t>Караман Дмитро Григорович</w:t>
       </w:r>
     </w:p>
     <w:p>

</xml_diff>